<commit_message>
finalize and restructred files
</commit_message>
<xml_diff>
--- a/docs/Transformer-I.docx
+++ b/docs/Transformer-I.docx
@@ -1525,16 +1525,22 @@
                 <w:szCs w:val="22"/>
               </w:rPr>
             </w:pPr>
-            <w:proofErr w:type="spellStart"/>
             <w:r>
               <w:rPr>
                 <w:bCs/>
                 <w:sz w:val="22"/>
                 <w:szCs w:val="22"/>
               </w:rPr>
-              <w:t>FFn’s</w:t>
-            </w:r>
-            <w:proofErr w:type="spellEnd"/>
+              <w:t>FF</w:t>
+            </w:r>
+            <w:r>
+              <w:rPr>
+                <w:bCs/>
+                <w:sz w:val="22"/>
+                <w:szCs w:val="22"/>
+              </w:rPr>
+              <w:t>N</w:t>
+            </w:r>
             <w:r>
               <w:rPr>
                 <w:bCs/>
@@ -1633,7 +1639,7 @@
                 <w:sz w:val="22"/>
                 <w:szCs w:val="22"/>
               </w:rPr>
-              <w:t>Number of attentions heads</w:t>
+              <w:t>Number of attention heads</w:t>
             </w:r>
           </w:p>
         </w:tc>
@@ -2870,6 +2876,14 @@
         </w:rPr>
         <w:t>Normalization addresses this directly: the input to each sub-layer is rescaled to have a mean of approximately 0 and a standard deviation of approximately 1, keeping activation values within a stable, consistent range regardless of depth. In addition, two learnable parameters are introduced, allowing the model to scale and shift the normalized output — so that normalization constrains the scale of activations without permanently removing the model's ability to represent values at other scales, if that proves useful for learning.</w:t>
       </w:r>
+      <w:r>
+        <w:rPr>
+          <w:bCs/>
+          <w:sz w:val="22"/>
+          <w:szCs w:val="22"/>
+        </w:rPr>
+        <w:t xml:space="preserve"> </w:t>
+      </w:r>
     </w:p>
     <w:p>
       <w:pPr>
@@ -3495,6 +3509,76 @@
           <w:szCs w:val="22"/>
         </w:rPr>
       </w:pPr>
+      <w:r>
+        <w:rPr>
+          <w:bCs/>
+          <w:sz w:val="22"/>
+          <w:szCs w:val="22"/>
+        </w:rPr>
+        <w:t xml:space="preserve">Note that </w:t>
+      </w:r>
+      <w:r>
+        <w:rPr>
+          <w:bCs/>
+          <w:sz w:val="22"/>
+          <w:szCs w:val="22"/>
+        </w:rPr>
+        <w:t xml:space="preserve">each block has their distinct </w:t>
+      </w:r>
+      <m:oMath>
+        <m:r>
+          <w:rPr>
+            <w:rFonts w:ascii="Cambria Math" w:hAnsi="Cambria Math"/>
+            <w:sz w:val="22"/>
+            <w:szCs w:val="22"/>
+          </w:rPr>
+          <m:t>γ,β</m:t>
+        </m:r>
+      </m:oMath>
+      <w:r>
+        <w:rPr>
+          <w:rFonts w:eastAsiaTheme="minorEastAsia"/>
+          <w:sz w:val="22"/>
+          <w:szCs w:val="22"/>
+        </w:rPr>
+        <w:t xml:space="preserve"> (</w:t>
+      </w:r>
+      <w:proofErr w:type="spellStart"/>
+      <w:r>
+        <w:rPr>
+          <w:rFonts w:eastAsiaTheme="minorEastAsia"/>
+          <w:sz w:val="22"/>
+          <w:szCs w:val="22"/>
+        </w:rPr>
+        <w:t>i.e</w:t>
+      </w:r>
+      <w:proofErr w:type="spellEnd"/>
+      <w:r>
+        <w:rPr>
+          <w:rFonts w:eastAsiaTheme="minorEastAsia"/>
+          <w:sz w:val="22"/>
+          <w:szCs w:val="22"/>
+        </w:rPr>
+        <w:t xml:space="preserve"> attention block , FFN block </w:t>
+      </w:r>
+      <w:proofErr w:type="spellStart"/>
+      <w:r>
+        <w:rPr>
+          <w:rFonts w:eastAsiaTheme="minorEastAsia"/>
+          <w:sz w:val="22"/>
+          <w:szCs w:val="22"/>
+        </w:rPr>
+        <w:t>etc</w:t>
+      </w:r>
+      <w:proofErr w:type="spellEnd"/>
+      <w:r>
+        <w:rPr>
+          <w:rFonts w:eastAsiaTheme="minorEastAsia"/>
+          <w:sz w:val="22"/>
+          <w:szCs w:val="22"/>
+        </w:rPr>
+        <w:t>)</w:t>
+      </w:r>
     </w:p>
     <w:p>
       <w:pPr>
@@ -10864,29 +10948,16 @@
         </w:rPr>
         <w:t>PE</w:t>
       </w:r>
-      <w:proofErr w:type="gramStart"/>
-      <w:r>
-        <w:rPr>
-          <w:rFonts w:ascii="Consolas" w:eastAsia="Times New Roman" w:hAnsi="Consolas" w:cs="Times New Roman"/>
-          <w:color w:val="BFBDB6"/>
-          <w:kern w:val="0"/>
-          <w:sz w:val="21"/>
-          <w:szCs w:val="21"/>
-          <w14:ligatures w14:val="none"/>
-        </w:rPr>
-        <w:t>[:,</w:t>
-      </w:r>
-      <w:proofErr w:type="gramEnd"/>
-      <w:r>
-        <w:rPr>
-          <w:rFonts w:ascii="Consolas" w:eastAsia="Times New Roman" w:hAnsi="Consolas" w:cs="Times New Roman"/>
-          <w:color w:val="BFBDB6"/>
-          <w:kern w:val="0"/>
-          <w:sz w:val="21"/>
-          <w:szCs w:val="21"/>
-          <w14:ligatures w14:val="none"/>
-        </w:rPr>
-        <w:t xml:space="preserve"> </w:t>
+      <w:r>
+        <w:rPr>
+          <w:rFonts w:ascii="Consolas" w:eastAsia="Times New Roman" w:hAnsi="Consolas" w:cs="Times New Roman"/>
+          <w:color w:val="BFBDB6"/>
+          <w:kern w:val="0"/>
+          <w:sz w:val="21"/>
+          <w:szCs w:val="21"/>
+          <w14:ligatures w14:val="none"/>
+        </w:rPr>
+        <w:t xml:space="preserve">[:, </w:t>
       </w:r>
       <w:r>
         <w:rPr>
@@ -11047,29 +11118,16 @@
         </w:rPr>
         <w:t>PE</w:t>
       </w:r>
-      <w:proofErr w:type="gramStart"/>
-      <w:r>
-        <w:rPr>
-          <w:rFonts w:ascii="Consolas" w:eastAsia="Times New Roman" w:hAnsi="Consolas" w:cs="Times New Roman"/>
-          <w:color w:val="BFBDB6"/>
-          <w:kern w:val="0"/>
-          <w:sz w:val="21"/>
-          <w:szCs w:val="21"/>
-          <w14:ligatures w14:val="none"/>
-        </w:rPr>
-        <w:t>[:,</w:t>
-      </w:r>
-      <w:proofErr w:type="gramEnd"/>
-      <w:r>
-        <w:rPr>
-          <w:rFonts w:ascii="Consolas" w:eastAsia="Times New Roman" w:hAnsi="Consolas" w:cs="Times New Roman"/>
-          <w:color w:val="BFBDB6"/>
-          <w:kern w:val="0"/>
-          <w:sz w:val="21"/>
-          <w:szCs w:val="21"/>
-          <w14:ligatures w14:val="none"/>
-        </w:rPr>
-        <w:t xml:space="preserve"> </w:t>
+      <w:r>
+        <w:rPr>
+          <w:rFonts w:ascii="Consolas" w:eastAsia="Times New Roman" w:hAnsi="Consolas" w:cs="Times New Roman"/>
+          <w:color w:val="BFBDB6"/>
+          <w:kern w:val="0"/>
+          <w:sz w:val="21"/>
+          <w:szCs w:val="21"/>
+          <w14:ligatures w14:val="none"/>
+        </w:rPr>
+        <w:t xml:space="preserve">[:, </w:t>
       </w:r>
       <w:r>
         <w:rPr>
@@ -12019,25 +12077,7 @@
           <w:sz w:val="22"/>
           <w:szCs w:val="22"/>
         </w:rPr>
-        <w:t xml:space="preserve"> </w:t>
-      </w:r>
-      <w:proofErr w:type="gramStart"/>
-      <w:r>
-        <w:rPr>
-          <w:bCs/>
-          <w:sz w:val="22"/>
-          <w:szCs w:val="22"/>
-        </w:rPr>
-        <w:t>is</w:t>
-      </w:r>
-      <w:proofErr w:type="gramEnd"/>
-      <w:r>
-        <w:rPr>
-          <w:bCs/>
-          <w:sz w:val="22"/>
-          <w:szCs w:val="22"/>
-        </w:rPr>
-        <w:t xml:space="preserve"> the key position (column)</w:t>
+        <w:t xml:space="preserve"> is the key position (column)</w:t>
       </w:r>
     </w:p>
     <w:p>
@@ -22555,6 +22595,147 @@
                   <w:sz w:val="28"/>
                   <w:szCs w:val="28"/>
                 </w:rPr>
+                <m:t>Z</m:t>
+              </m:r>
+            </m:e>
+            <m:sub>
+              <m:r>
+                <w:rPr>
+                  <w:rFonts w:ascii="Cambria Math" w:eastAsiaTheme="minorEastAsia" w:hAnsi="Cambria Math"/>
+                  <w:sz w:val="28"/>
+                  <w:szCs w:val="28"/>
+                </w:rPr>
+                <m:t>0</m:t>
+              </m:r>
+            </m:sub>
+          </m:sSub>
+          <m:r>
+            <w:rPr>
+              <w:rFonts w:ascii="Cambria Math" w:eastAsiaTheme="minorEastAsia" w:hAnsi="Cambria Math"/>
+              <w:sz w:val="28"/>
+              <w:szCs w:val="28"/>
+            </w:rPr>
+            <m:t>=</m:t>
+          </m:r>
+          <m:r>
+            <w:rPr>
+              <w:rFonts w:ascii="Cambria Math" w:eastAsiaTheme="minorEastAsia" w:hAnsi="Cambria Math"/>
+              <w:sz w:val="28"/>
+              <w:szCs w:val="28"/>
+            </w:rPr>
+            <m:t xml:space="preserve"> </m:t>
+          </m:r>
+          <m:r>
+            <w:rPr>
+              <w:rFonts w:ascii="Cambria Math" w:eastAsiaTheme="minorEastAsia" w:hAnsi="Cambria Math"/>
+              <w:sz w:val="28"/>
+              <w:szCs w:val="28"/>
+            </w:rPr>
+            <m:t>Xn2.</m:t>
+          </m:r>
+          <m:sSub>
+            <m:sSubPr>
+              <m:ctrlPr>
+                <w:rPr>
+                  <w:rFonts w:ascii="Cambria Math" w:eastAsiaTheme="minorEastAsia" w:hAnsi="Cambria Math"/>
+                  <w:sz w:val="28"/>
+                  <w:szCs w:val="28"/>
+                </w:rPr>
+              </m:ctrlPr>
+            </m:sSubPr>
+            <m:e>
+              <m:r>
+                <m:rPr>
+                  <m:sty m:val="p"/>
+                </m:rPr>
+                <w:rPr>
+                  <w:rFonts w:ascii="Cambria Math" w:eastAsiaTheme="minorEastAsia" w:hAnsi="Cambria Math"/>
+                  <w:sz w:val="28"/>
+                  <w:szCs w:val="28"/>
+                </w:rPr>
+                <m:t>W</m:t>
+              </m:r>
+            </m:e>
+            <m:sub>
+              <m:r>
+                <w:rPr>
+                  <w:rFonts w:ascii="Cambria Math" w:eastAsiaTheme="minorEastAsia" w:hAnsi="Cambria Math"/>
+                  <w:sz w:val="28"/>
+                  <w:szCs w:val="28"/>
+                </w:rPr>
+                <m:t>0</m:t>
+              </m:r>
+            </m:sub>
+          </m:sSub>
+          <m:r>
+            <w:rPr>
+              <w:rFonts w:ascii="Cambria Math" w:eastAsiaTheme="minorEastAsia" w:hAnsi="Cambria Math"/>
+              <w:sz w:val="28"/>
+              <w:szCs w:val="28"/>
+            </w:rPr>
+            <m:t>+</m:t>
+          </m:r>
+          <m:sSub>
+            <m:sSubPr>
+              <m:ctrlPr>
+                <w:rPr>
+                  <w:rFonts w:ascii="Cambria Math" w:eastAsiaTheme="minorEastAsia" w:hAnsi="Cambria Math"/>
+                  <w:sz w:val="28"/>
+                  <w:szCs w:val="28"/>
+                </w:rPr>
+              </m:ctrlPr>
+            </m:sSubPr>
+            <m:e>
+              <m:r>
+                <w:rPr>
+                  <w:rFonts w:ascii="Cambria Math" w:eastAsiaTheme="minorEastAsia" w:hAnsi="Cambria Math"/>
+                  <w:sz w:val="28"/>
+                  <w:szCs w:val="28"/>
+                </w:rPr>
+                <m:t>B</m:t>
+              </m:r>
+            </m:e>
+            <m:sub>
+              <m:r>
+                <w:rPr>
+                  <w:rFonts w:ascii="Cambria Math" w:eastAsiaTheme="minorEastAsia" w:hAnsi="Cambria Math"/>
+                  <w:sz w:val="28"/>
+                  <w:szCs w:val="28"/>
+                </w:rPr>
+                <m:t>0</m:t>
+              </m:r>
+            </m:sub>
+          </m:sSub>
+        </m:oMath>
+      </m:oMathPara>
+    </w:p>
+    <w:p>
+      <w:pPr>
+        <w:rPr>
+          <w:rFonts w:eastAsiaTheme="minorEastAsia"/>
+          <w:sz w:val="28"/>
+          <w:szCs w:val="28"/>
+        </w:rPr>
+      </w:pPr>
+      <m:oMathPara>
+        <m:oMath>
+          <m:sSub>
+            <m:sSubPr>
+              <m:ctrlPr>
+                <w:rPr>
+                  <w:rFonts w:ascii="Cambria Math" w:eastAsiaTheme="minorEastAsia" w:hAnsi="Cambria Math"/>
+                  <w:sz w:val="28"/>
+                  <w:szCs w:val="28"/>
+                </w:rPr>
+              </m:ctrlPr>
+            </m:sSubPr>
+            <m:e>
+              <m:r>
+                <w:rPr>
+                  <w:rFonts w:ascii="Cambria Math" w:eastAsiaTheme="minorEastAsia" w:hAnsi="Cambria Math"/>
+                  <w:sz w:val="28"/>
+                  <w:szCs w:val="28"/>
+                </w:rPr>
                 <m:t>A</m:t>
               </m:r>
             </m:e>
@@ -22588,56 +22769,6 @@
               </m:ctrlPr>
             </m:dPr>
             <m:e>
-              <m:r>
-                <w:rPr>
-                  <w:rFonts w:ascii="Cambria Math" w:eastAsiaTheme="minorEastAsia" w:hAnsi="Cambria Math"/>
-                  <w:sz w:val="28"/>
-                  <w:szCs w:val="28"/>
-                </w:rPr>
-                <m:t>Xn2.</m:t>
-              </m:r>
-              <m:sSub>
-                <m:sSubPr>
-                  <m:ctrlPr>
-                    <w:rPr>
-                      <w:rFonts w:ascii="Cambria Math" w:eastAsiaTheme="minorEastAsia" w:hAnsi="Cambria Math"/>
-                      <w:sz w:val="28"/>
-                      <w:szCs w:val="28"/>
-                    </w:rPr>
-                  </m:ctrlPr>
-                </m:sSubPr>
-                <m:e>
-                  <m:r>
-                    <m:rPr>
-                      <m:sty m:val="p"/>
-                    </m:rPr>
-                    <w:rPr>
-                      <w:rFonts w:ascii="Cambria Math" w:eastAsiaTheme="minorEastAsia" w:hAnsi="Cambria Math"/>
-                      <w:sz w:val="28"/>
-                      <w:szCs w:val="28"/>
-                    </w:rPr>
-                    <m:t>W</m:t>
-                  </m:r>
-                </m:e>
-                <m:sub>
-                  <m:r>
-                    <w:rPr>
-                      <w:rFonts w:ascii="Cambria Math" w:eastAsiaTheme="minorEastAsia" w:hAnsi="Cambria Math"/>
-                      <w:sz w:val="28"/>
-                      <w:szCs w:val="28"/>
-                    </w:rPr>
-                    <m:t>0</m:t>
-                  </m:r>
-                </m:sub>
-              </m:sSub>
-              <m:r>
-                <w:rPr>
-                  <w:rFonts w:ascii="Cambria Math" w:eastAsiaTheme="minorEastAsia" w:hAnsi="Cambria Math"/>
-                  <w:sz w:val="28"/>
-                  <w:szCs w:val="28"/>
-                </w:rPr>
-                <m:t>+</m:t>
-              </m:r>
               <m:sSub>
                 <m:sSubPr>
                   <m:ctrlPr>
@@ -22655,7 +22786,7 @@
                       <w:sz w:val="28"/>
                       <w:szCs w:val="28"/>
                     </w:rPr>
-                    <m:t>B</m:t>
+                    <m:t>Z</m:t>
                   </m:r>
                 </m:e>
                 <m:sub>
@@ -23134,6 +23265,7 @@
           <w:sz w:val="22"/>
           <w:szCs w:val="22"/>
         </w:rPr>
+        <w:lastRenderedPageBreak/>
         <w:t>Xfn</w:t>
       </w:r>
       <w:proofErr w:type="spellEnd"/>
@@ -23223,7 +23355,6 @@
           <w:sz w:val="26"/>
           <w:szCs w:val="26"/>
         </w:rPr>
-        <w:lastRenderedPageBreak/>
         <w:t>Shape</w:t>
       </w:r>
       <w:r>
@@ -23810,7 +23941,15 @@
                 <w:sz w:val="22"/>
                 <w:szCs w:val="22"/>
               </w:rPr>
-              <w:t>A1</w:t>
+              <w:t>Z</w:t>
+            </w:r>
+            <w:r>
+              <w:rPr>
+                <w:rFonts w:eastAsiaTheme="minorEastAsia"/>
+                <w:sz w:val="22"/>
+                <w:szCs w:val="22"/>
+              </w:rPr>
+              <w:t>1</w:t>
             </w:r>
           </w:p>
         </w:tc>
@@ -24640,6 +24779,17 @@
         </w:rPr>
         <w:t>Xat,epsilon</w:t>
       </w:r>
+      <w:r>
+        <w:rPr>
+          <w:rFonts w:ascii="Consolas" w:eastAsia="Times New Roman" w:hAnsi="Consolas" w:cs="Times New Roman"/>
+          <w:color w:val="D2A6FF"/>
+          <w:kern w:val="0"/>
+          <w:sz w:val="21"/>
+          <w:szCs w:val="21"/>
+          <w14:ligatures w14:val="none"/>
+        </w:rPr>
+        <w:t>,gamma,beta</w:t>
+      </w:r>
       <w:proofErr w:type="spellEnd"/>
       <w:r>
         <w:rPr>
@@ -25436,9 +25586,8 @@
           <w:sz w:val="26"/>
           <w:szCs w:val="26"/>
         </w:rPr>
-        <w:t>Output Project/</w:t>
-      </w:r>
-      <w:proofErr w:type="spellStart"/>
+        <w:t>Output Project</w:t>
+      </w:r>
       <w:r>
         <w:rPr>
           <w:rFonts w:eastAsiaTheme="minorEastAsia"/>
@@ -25446,6 +25595,25 @@
           <w:sz w:val="26"/>
           <w:szCs w:val="26"/>
         </w:rPr>
+        <w:t>ion</w:t>
+      </w:r>
+      <w:r>
+        <w:rPr>
+          <w:rFonts w:eastAsiaTheme="minorEastAsia"/>
+          <w:b/>
+          <w:sz w:val="26"/>
+          <w:szCs w:val="26"/>
+        </w:rPr>
+        <w:t>/</w:t>
+      </w:r>
+      <w:proofErr w:type="spellStart"/>
+      <w:r>
+        <w:rPr>
+          <w:rFonts w:eastAsiaTheme="minorEastAsia"/>
+          <w:b/>
+          <w:sz w:val="26"/>
+          <w:szCs w:val="26"/>
+        </w:rPr>
         <w:t>UnEmbeddings</w:t>
       </w:r>
       <w:proofErr w:type="spellEnd"/>
@@ -25501,7 +25669,17 @@
           <w:sz w:val="22"/>
           <w:szCs w:val="22"/>
         </w:rPr>
-        <w:t xml:space="preserve">-dimensional space, the final output is required as a probability distribution over the entire vocabulary. Producing this requires one last transformation, projecting from </w:t>
+        <w:t xml:space="preserve">-dimensional space, the final output is required as a probability distribution over the entire vocabulary. Producing this requires </w:t>
+      </w:r>
+      <w:r>
+        <w:rPr>
+          <w:rFonts w:eastAsiaTheme="minorEastAsia"/>
+          <w:bCs/>
+          <w:sz w:val="22"/>
+          <w:szCs w:val="22"/>
+        </w:rPr>
+        <w:lastRenderedPageBreak/>
+        <w:t xml:space="preserve">one last transformation, projecting from </w:t>
       </w:r>
       <w:proofErr w:type="spellStart"/>
       <w:r>
@@ -25521,17 +25699,7 @@
           <w:sz w:val="22"/>
           <w:szCs w:val="22"/>
         </w:rPr>
-        <w:t xml:space="preserve"> to vocabulary size via the unembedding matrix, Wu. Since this implementation uses pre-LN, the residual stream itself is never normalized during the forward </w:t>
-      </w:r>
-      <w:r>
-        <w:rPr>
-          <w:rFonts w:eastAsiaTheme="minorEastAsia"/>
-          <w:bCs/>
-          <w:sz w:val="22"/>
-          <w:szCs w:val="22"/>
-        </w:rPr>
-        <w:lastRenderedPageBreak/>
-        <w:t xml:space="preserve">pass — each block only normalizes a copy of it before feeding it into a sub-layer, while the stream itself continues to accumulate un-normalized. A final </w:t>
+        <w:t xml:space="preserve"> to vocabulary size via the unembedding matrix, Wu. Since this implementation uses pre-LN, the residual stream itself is never normalized during the forward pass — each block only normalizes a copy of it before feeding it into a sub-layer, while the stream itself continues to accumulate un-normalized. A final </w:t>
       </w:r>
       <w:proofErr w:type="spellStart"/>
       <w:r>
@@ -26185,23 +26353,53 @@
         </w:rPr>
         <w:t xml:space="preserve"> distribution over the </w:t>
       </w:r>
-      <w:proofErr w:type="spellStart"/>
-      <w:r>
-        <w:rPr>
-          <w:rFonts w:eastAsiaTheme="minorEastAsia"/>
-          <w:sz w:val="22"/>
-          <w:szCs w:val="22"/>
-        </w:rPr>
-        <w:t>vocabularity</w:t>
-      </w:r>
-      <w:proofErr w:type="spellEnd"/>
-      <w:r>
-        <w:rPr>
-          <w:rFonts w:eastAsiaTheme="minorEastAsia"/>
-          <w:sz w:val="22"/>
-          <w:szCs w:val="22"/>
-        </w:rPr>
-        <w:t xml:space="preserve"> , of shape (</w:t>
+      <w:r>
+        <w:rPr>
+          <w:rFonts w:eastAsiaTheme="minorEastAsia"/>
+          <w:sz w:val="22"/>
+          <w:szCs w:val="22"/>
+        </w:rPr>
+        <w:t xml:space="preserve">entire </w:t>
+      </w:r>
+      <w:r>
+        <w:rPr>
+          <w:rFonts w:eastAsiaTheme="minorEastAsia"/>
+          <w:sz w:val="22"/>
+          <w:szCs w:val="22"/>
+        </w:rPr>
+        <w:t>vocabula</w:t>
+      </w:r>
+      <w:r>
+        <w:rPr>
+          <w:rFonts w:eastAsiaTheme="minorEastAsia"/>
+          <w:sz w:val="22"/>
+          <w:szCs w:val="22"/>
+        </w:rPr>
+        <w:t>r</w:t>
+      </w:r>
+      <w:r>
+        <w:rPr>
+          <w:rFonts w:eastAsiaTheme="minorEastAsia"/>
+          <w:sz w:val="22"/>
+          <w:szCs w:val="22"/>
+        </w:rPr>
+        <w:t xml:space="preserve">y </w:t>
+      </w:r>
+      <w:r>
+        <w:rPr>
+          <w:rFonts w:eastAsiaTheme="minorEastAsia"/>
+          <w:sz w:val="22"/>
+          <w:szCs w:val="22"/>
+        </w:rPr>
+        <w:t>(all characters )</w:t>
+      </w:r>
+      <w:r>
+        <w:rPr>
+          <w:rFonts w:eastAsiaTheme="minorEastAsia"/>
+          <w:sz w:val="22"/>
+          <w:szCs w:val="22"/>
+        </w:rPr>
+        <w:t>, of shape (</w:t>
       </w:r>
       <w:proofErr w:type="spellStart"/>
       <w:r>
@@ -26911,7 +27109,17 @@
           <w:sz w:val="22"/>
           <w:szCs w:val="22"/>
         </w:rPr>
-        <w:t>3.4</w:t>
+        <w:t>3.</w:t>
+      </w:r>
+      <w:r>
+        <w:rPr>
+          <w:rFonts w:eastAsiaTheme="minorEastAsia"/>
+          <w:i/>
+          <w:iCs/>
+          <w:sz w:val="22"/>
+          <w:szCs w:val="22"/>
+        </w:rPr>
+        <w:t>5</w:t>
       </w:r>
       <w:r>
         <w:rPr>
@@ -26948,7 +27156,6 @@
           <w:sz w:val="26"/>
           <w:szCs w:val="26"/>
         </w:rPr>
-        <w:lastRenderedPageBreak/>
         <w:t xml:space="preserve">NumPy Implementation: </w:t>
       </w:r>
     </w:p>
@@ -27223,19 +27430,79 @@
           <w:szCs w:val="21"/>
           <w14:ligatures w14:val="none"/>
         </w:rPr>
-        <w:t>Xfn</w:t>
+        <w:t>X</w:t>
+      </w:r>
+      <w:r>
+        <w:rPr>
+          <w:rFonts w:ascii="Consolas" w:eastAsia="Times New Roman" w:hAnsi="Consolas" w:cs="Times New Roman"/>
+          <w:color w:val="D2A6FF"/>
+          <w:kern w:val="0"/>
+          <w:sz w:val="21"/>
+          <w:szCs w:val="21"/>
+          <w14:ligatures w14:val="none"/>
+        </w:rPr>
+        <w:t>fn</w:t>
       </w:r>
       <w:proofErr w:type="spellEnd"/>
       <w:r>
         <w:rPr>
           <w:rFonts w:ascii="Consolas" w:eastAsia="Times New Roman" w:hAnsi="Consolas" w:cs="Times New Roman"/>
-          <w:color w:val="BFBDB6"/>
-          <w:kern w:val="0"/>
-          <w:sz w:val="21"/>
-          <w:szCs w:val="21"/>
-          <w14:ligatures w14:val="none"/>
-        </w:rPr>
-        <w:t>, epsilon)</w:t>
+          <w:color w:val="D2A6FF"/>
+          <w:kern w:val="0"/>
+          <w:sz w:val="21"/>
+          <w:szCs w:val="21"/>
+          <w14:ligatures w14:val="none"/>
+        </w:rPr>
+        <w:t>,</w:t>
+      </w:r>
+      <w:r>
+        <w:t xml:space="preserve"> </w:t>
+      </w:r>
+      <w:proofErr w:type="spellStart"/>
+      <w:r>
+        <w:rPr>
+          <w:rFonts w:ascii="Consolas" w:eastAsia="Times New Roman" w:hAnsi="Consolas" w:cs="Times New Roman"/>
+          <w:color w:val="D2A6FF"/>
+          <w:kern w:val="0"/>
+          <w:sz w:val="21"/>
+          <w:szCs w:val="21"/>
+          <w14:ligatures w14:val="none"/>
+        </w:rPr>
+        <w:t>epsilon,gamma</w:t>
+      </w:r>
+      <w:proofErr w:type="spellEnd"/>
+      <w:r>
+        <w:rPr>
+          <w:rFonts w:ascii="Consolas" w:eastAsia="Times New Roman" w:hAnsi="Consolas" w:cs="Times New Roman"/>
+          <w:color w:val="D2A6FF"/>
+          <w:kern w:val="0"/>
+          <w:sz w:val="21"/>
+          <w:szCs w:val="21"/>
+          <w14:ligatures w14:val="none"/>
+        </w:rPr>
+        <w:t>, beta</w:t>
+      </w:r>
+      <w:r>
+        <w:rPr>
+          <w:rFonts w:ascii="Consolas" w:eastAsia="Times New Roman" w:hAnsi="Consolas" w:cs="Times New Roman"/>
+          <w:color w:val="D2A6FF"/>
+          <w:kern w:val="0"/>
+          <w:sz w:val="21"/>
+          <w:szCs w:val="21"/>
+          <w14:ligatures w14:val="none"/>
+        </w:rPr>
+        <w:t xml:space="preserve"> </w:t>
+      </w:r>
+      <w:r>
+        <w:rPr>
+          <w:rFonts w:ascii="Consolas" w:eastAsia="Times New Roman" w:hAnsi="Consolas" w:cs="Times New Roman"/>
+          <w:color w:val="BFBDB6"/>
+          <w:kern w:val="0"/>
+          <w:sz w:val="21"/>
+          <w:szCs w:val="21"/>
+          <w14:ligatures w14:val="none"/>
+        </w:rPr>
+        <w:t>)</w:t>
       </w:r>
     </w:p>
     <w:p>
@@ -27917,6 +28184,7 @@
               <w:sz w:val="28"/>
               <w:szCs w:val="28"/>
             </w:rPr>
+            <w:lastRenderedPageBreak/>
             <m:t>Y=LayerNorm</m:t>
           </m:r>
           <m:d>
@@ -28030,40 +28298,7 @@
           <w:sz w:val="22"/>
           <w:szCs w:val="22"/>
         </w:rPr>
-        <w:lastRenderedPageBreak/>
-        <w:t xml:space="preserve">It is well established that, by stabilizing activation variance at a constant scale, </w:t>
-      </w:r>
-      <w:proofErr w:type="gramStart"/>
-      <w:r>
-        <w:rPr>
-          <w:sz w:val="22"/>
-          <w:szCs w:val="22"/>
-        </w:rPr>
-        <w:t>Post-LN</w:t>
-      </w:r>
-      <w:proofErr w:type="gramEnd"/>
-      <w:r>
-        <w:rPr>
-          <w:sz w:val="22"/>
-          <w:szCs w:val="22"/>
-        </w:rPr>
-        <w:t xml:space="preserve"> prevents activations from growing unbounded. However, because gradients flowing back through the residual connection must also pass through this normalization step, </w:t>
-      </w:r>
-      <w:proofErr w:type="gramStart"/>
-      <w:r>
-        <w:rPr>
-          <w:sz w:val="22"/>
-          <w:szCs w:val="22"/>
-        </w:rPr>
-        <w:t>Post-LN</w:t>
-      </w:r>
-      <w:proofErr w:type="gramEnd"/>
-      <w:r>
-        <w:rPr>
-          <w:sz w:val="22"/>
-          <w:szCs w:val="22"/>
-        </w:rPr>
-        <w:t xml:space="preserve"> produces large gradients near the output layer at initialization — and this magnitude does not naturally decay as gradients propagate toward earlier layers. Several studies (Xiong et al., 2020; Kedia et al., 2024) show this can degrade gradient flow in deeper networks, causing instability that typically requires a carefully tuned learning-rate warmup schedule to avoid divergence, and can otherwise lead to vanishing gradients and slower convergence.</w:t>
+        <w:t>It is well established that, by stabilizing activation variance at a constant scale, Post-LN prevents activations from growing unbounded. However, because gradients flowing back through the residual connection must also pass through this normalization step, Post-LN produces large gradients near the output layer at initialization — and this magnitude does not naturally decay as gradients propagate toward earlier layers. Several studies (Xiong et al., 2020; Kedia et al., 2024) show this can degrade gradient flow in deeper networks, causing instability that typically requires a carefully tuned learning-rate warmup schedule to avoid divergence, and can otherwise lead to vanishing gradients and slower convergence.</w:t>
       </w:r>
     </w:p>
     <w:p>
@@ -28228,55 +28463,7 @@
           <w:sz w:val="22"/>
           <w:szCs w:val="22"/>
         </w:rPr>
-        <w:t xml:space="preserve">where Y is the sum of the module's output and the original input X0. Note that normalization is applied to the input before the module function, and the residual connection carries the raw, un-normalized input forward. Additionally, a final normalization is applied after the last stacked block. Unlike </w:t>
-      </w:r>
-      <w:proofErr w:type="gramStart"/>
-      <w:r>
-        <w:rPr>
-          <w:sz w:val="22"/>
-          <w:szCs w:val="22"/>
-        </w:rPr>
-        <w:t>Post-LN</w:t>
-      </w:r>
-      <w:proofErr w:type="gramEnd"/>
-      <w:r>
-        <w:rPr>
-          <w:sz w:val="22"/>
-          <w:szCs w:val="22"/>
-        </w:rPr>
-        <w:t xml:space="preserve">, gradients in </w:t>
-      </w:r>
-      <w:proofErr w:type="gramStart"/>
-      <w:r>
-        <w:rPr>
-          <w:sz w:val="22"/>
-          <w:szCs w:val="22"/>
-        </w:rPr>
-        <w:t>Pre-LN</w:t>
-      </w:r>
-      <w:proofErr w:type="gramEnd"/>
-      <w:r>
-        <w:rPr>
-          <w:sz w:val="22"/>
-          <w:szCs w:val="22"/>
-        </w:rPr>
-        <w:t xml:space="preserve"> are freer to flow directly to earlier layers via the residual path, which helps stabilize early training. Nonetheless, even </w:t>
-      </w:r>
-      <w:proofErr w:type="gramStart"/>
-      <w:r>
-        <w:rPr>
-          <w:sz w:val="22"/>
-          <w:szCs w:val="22"/>
-        </w:rPr>
-        <w:t>Pre-LN</w:t>
-      </w:r>
-      <w:proofErr w:type="gramEnd"/>
-      <w:r>
-        <w:rPr>
-          <w:sz w:val="22"/>
-          <w:szCs w:val="22"/>
-        </w:rPr>
-        <w:t xml:space="preserve"> is not immune to instability in deep Transformers: the continuous, un-normalized residual "highway" can allow magnitude spikes produced by any individual module to accumulate unchecked across layers. This phenomenon may be related to the massive activations observed in trained models</w:t>
+        <w:t>where Y is the sum of the module's output and the original input X0. Note that normalization is applied to the input before the module function, and the residual connection carries the raw, un-normalized input forward. Additionally, a final normalization is applied after the last stacked block. Unlike Post-LN, gradients in Pre-LN are freer to flow directly to earlier layers via the residual path, which helps stabilize early training. Nonetheless, even Pre-LN is not immune to instability in deep Transformers: the continuous, un-normalized residual "highway" can allow magnitude spikes produced by any individual module to accumulate unchecked across layers. This phenomenon may be related to the massive activations observed in trained models</w:t>
       </w:r>
       <w:r>
         <w:rPr>
@@ -28441,7 +28628,16 @@
           <w:sz w:val="22"/>
           <w:szCs w:val="22"/>
         </w:rPr>
-        <w:t>Three broad architectural families exist, each tied to a different training objective: encoder-only models (e.g., BERT), trained with bidirectional masked language modeling, suited to understanding tasks such as classification; encoder-decoder models, which process an input into an intermediate representation before generating an output, suited to sequence-to-sequence tasks such as translation; and decoder-only models, trained on causal language modeling, suited to open-ended generation.</w:t>
+        <w:t xml:space="preserve">Three broad architectural families exist, each tied to a different training objective: encoder-only models (e.g., BERT), trained with bidirectional masked language modeling, suited to understanding tasks such as classification; encoder-decoder models, which process an input into an intermediate representation </w:t>
+      </w:r>
+      <w:r>
+        <w:rPr>
+          <w:rFonts w:eastAsiaTheme="minorEastAsia"/>
+          <w:sz w:val="22"/>
+          <w:szCs w:val="22"/>
+        </w:rPr>
+        <w:lastRenderedPageBreak/>
+        <w:t>before generating an output, suited to sequence-to-sequence tasks such as translation; and decoder-only models, trained on causal language modeling, suited to open-ended generation.</w:t>
       </w:r>
     </w:p>
     <w:p>
@@ -28477,7 +28673,6 @@
           <w:sz w:val="22"/>
           <w:szCs w:val="22"/>
         </w:rPr>
-        <w:lastRenderedPageBreak/>
         <w:t>Causal masking restricts each position's attention to itself and preceding positions, ensuring a token's prediction depends only on prior context (Radford et al., 2018). This enforces the autoregressive property: generation proceeds one token at a time, with each generated token fed back in as context for the next, under a constraint identical to the one used during training.</w:t>
       </w:r>
     </w:p>
@@ -28773,7 +28968,16 @@
           <w:sz w:val="22"/>
           <w:szCs w:val="22"/>
         </w:rPr>
-        <w:t>This implementation prioritizes explicit, independently traceable computation for each head over parameter or memory efficiency, following the original formulation (Vaswani et al., 2017). This trade-off favors clarity here, but would be reconsidered for a production-scale implementation, where the efficiency gains from shared projections become significant.</w:t>
+        <w:t xml:space="preserve">This implementation prioritizes explicit, independently traceable computation for each head over parameter or memory efficiency, following the original formulation (Vaswani et al., 2017). This trade-off </w:t>
+      </w:r>
+      <w:r>
+        <w:rPr>
+          <w:rFonts w:eastAsiaTheme="minorEastAsia"/>
+          <w:sz w:val="22"/>
+          <w:szCs w:val="22"/>
+        </w:rPr>
+        <w:lastRenderedPageBreak/>
+        <w:t>favors clarity here, but would be reconsidered for a production-scale implementation, where the efficiency gains from shared projections become significant.</w:t>
       </w:r>
     </w:p>
     <w:p>
@@ -28827,7 +29031,6 @@
           <w:sz w:val="22"/>
           <w:szCs w:val="22"/>
         </w:rPr>
-        <w:lastRenderedPageBreak/>
         <w:t xml:space="preserve">Geva, M., Schuster, R., </w:t>
       </w:r>
       <w:proofErr w:type="spellStart"/>
@@ -29626,7 +29829,17 @@
           <w:sz w:val="22"/>
           <w:szCs w:val="22"/>
         </w:rPr>
-        <w:t>Since most of the conceptual groundwork and theory has already been established in this document, Part 2 will be considerably more math-heavy, with comparatively little additional theory — the focus shifts to deriving and presenting the gradient computations themselves, building directly on the architecture and notation defined here.</w:t>
+        <w:t xml:space="preserve">Since most of the conceptual groundwork and theory has already been established in this document, Part 2 will be considerably more math-heavy, with comparatively little additional theory — the focus </w:t>
+      </w:r>
+      <w:r>
+        <w:rPr>
+          <w:rFonts w:eastAsiaTheme="minorEastAsia"/>
+          <w:bCs/>
+          <w:sz w:val="22"/>
+          <w:szCs w:val="22"/>
+        </w:rPr>
+        <w:lastRenderedPageBreak/>
+        <w:t>shifts to deriving and presenting the gradient computations themselves, building directly on the architecture and notation defined here.</w:t>
       </w:r>
     </w:p>
     <w:p>
@@ -31547,7 +31760,7 @@
   <w:style w:type="paragraph" w:default="1" w:styleId="Normal">
     <w:name w:val="Normal"/>
     <w:qFormat/>
-    <w:rsid w:val="0088044B"/>
+    <w:rsid w:val="00156C38"/>
   </w:style>
   <w:style w:type="paragraph" w:styleId="Heading1">
     <w:name w:val="heading 1"/>

</xml_diff>